<commit_message>
feat: ajustar indisponibilidade e estilizar pagina de login
</commit_message>
<xml_diff>
--- a/public/templates/feedback_template.docx
+++ b/public/templates/feedback_template.docx
@@ -15,10 +15,10 @@
           <w:sz w:val="34"/>
           <w:szCs w:val="34"/>
         </w:rPr>
-        <w:t xml:space="preserve">RELATÓRIO DA SEMANA</w:t>
+        <w:t xml:space="preserve">RELATÓRIO DA SEMANA – CONSOLIDADO</w:t>
       </w:r>
     </w:p>
-    <w:p xmlns:wp14="http://schemas.microsoft.com/office/word/2010/wordml" wp14:textId="6F2A244F">
+    <w:p xmlns:wp14="http://schemas.microsoft.com/office/word/2010/wordml" wp14:textId="77777777">
       <w:pPr>
         <w:spacing w:after="280"/>
         <w:jc w:val="center"/>
@@ -31,20 +31,12 @@
           <w:szCs w:val="21"/>
           <w:lang w:val="en-US"/>
         </w:rPr>
-        <w:t>Período avaliado: {periodo}</w:t>
+        <w:t>Período avaliado:  {periodo}</w:t>
       </w:r>
     </w:p>
-    <w:p xmlns:wp14="http://schemas.microsoft.com/office/word/2010/wordml" wp14:textId="092DA20A">
+    <w:p xmlns:wp14="http://schemas.microsoft.com/office/word/2010/wordml" wp14:textId="77777777">
       <w:pPr>
-        <w:pStyle w:val="Normal"/>
         <w:spacing w:after="90"/>
-        <w:rPr>
-          <w:rFonts w:ascii="Arial" w:hAnsi="Arial" w:eastAsia="Arial" w:cs="Arial"/>
-          <w:color w:val="auto"/>
-          <w:sz w:val="20"/>
-          <w:szCs w:val="20"/>
-          <w:lang w:val="en-US"/>
-        </w:rPr>
       </w:pPr>
       <w:r>
         <w:rPr>
@@ -55,43 +47,19 @@
           <w:szCs w:val="20"/>
           <w:lang w:val="en-US"/>
         </w:rPr>
-        <w:t>Operador:</w:t>
+        <w:t xml:space="preserve">Operador:  </w:t>
       </w:r>
       <w:r>
         <w:rPr>
           <w:rFonts w:ascii="Arial" w:hAnsi="Arial" w:eastAsia="Arial" w:cs="Arial"/>
-          <w:color w:val="auto"/>
           <w:sz w:val="20"/>
           <w:szCs w:val="20"/>
           <w:lang w:val="en-US"/>
         </w:rPr>
-        <w:t xml:space="preserve"> {operador}</w:t>
+        <w:t>{operador}</w:t>
       </w:r>
     </w:p>
-    <w:p xmlns:wp14="http://schemas.microsoft.com/office/word/2010/wordml" wp14:textId="160B8E4C">
-      <w:pPr>
-        <w:spacing w:after="90"/>
-      </w:pPr>
-      <w:r>
-        <w:rPr>
-          <w:rFonts w:ascii="Arial" w:hAnsi="Arial" w:eastAsia="Arial" w:cs="Arial"/>
-          <w:b w:val="1"/>
-          <w:bCs w:val="1"/>
-          <w:sz w:val="20"/>
-          <w:szCs w:val="20"/>
-        </w:rPr>
-        <w:t xml:space="preserve">Supervisor: </w:t>
-      </w:r>
-      <w:r>
-        <w:rPr>
-          <w:rFonts w:ascii="Arial" w:hAnsi="Arial" w:eastAsia="Arial" w:cs="Arial"/>
-          <w:sz w:val="20"/>
-          <w:szCs w:val="20"/>
-        </w:rPr>
-        <w:t>{supervisor}</w:t>
-      </w:r>
-    </w:p>
-    <w:p xmlns:wp14="http://schemas.microsoft.com/office/word/2010/wordml" wp14:textId="70DBF70F">
+    <w:p xmlns:wp14="http://schemas.microsoft.com/office/word/2010/wordml" wp14:textId="77777777">
       <w:pPr>
         <w:spacing w:after="90"/>
       </w:pPr>
@@ -104,7 +72,32 @@
           <w:szCs w:val="20"/>
           <w:lang w:val="en-US"/>
         </w:rPr>
-        <w:t xml:space="preserve">Data do feedback: </w:t>
+        <w:t xml:space="preserve">Supervisor:  </w:t>
+      </w:r>
+      <w:r>
+        <w:rPr>
+          <w:rFonts w:ascii="Arial" w:hAnsi="Arial" w:eastAsia="Arial" w:cs="Arial"/>
+          <w:sz w:val="20"/>
+          <w:szCs w:val="20"/>
+          <w:lang w:val="en-US"/>
+        </w:rPr>
+        <w:t>{supervisor}</w:t>
+      </w:r>
+    </w:p>
+    <w:p xmlns:wp14="http://schemas.microsoft.com/office/word/2010/wordml" wp14:textId="77777777">
+      <w:pPr>
+        <w:spacing w:after="90"/>
+      </w:pPr>
+      <w:r>
+        <w:rPr>
+          <w:rFonts w:ascii="Arial" w:hAnsi="Arial" w:eastAsia="Arial" w:cs="Arial"/>
+          <w:b w:val="1"/>
+          <w:bCs w:val="1"/>
+          <w:sz w:val="20"/>
+          <w:szCs w:val="20"/>
+          <w:lang w:val="en-US"/>
+        </w:rPr>
+        <w:t xml:space="preserve">Data do feedback:  </w:t>
       </w:r>
       <w:r>
         <w:rPr>
@@ -121,7 +114,7 @@
         <w:pBdr>
           <w:bottom w:val="single" w:color="000000" w:sz="8" w:space="3"/>
         </w:pBdr>
-        <w:spacing w:before="180" w:after="130"/>
+        <w:spacing w:before="280" w:after="130"/>
       </w:pPr>
       <w:r>
         <w:rPr>
@@ -136,7 +129,7 @@
         <w:t>Objetivo do feedback</w:t>
       </w:r>
     </w:p>
-    <w:p xmlns:wp14="http://schemas.microsoft.com/office/word/2010/wordml" wp14:textId="4178D737">
+    <w:p xmlns:wp14="http://schemas.microsoft.com/office/word/2010/wordml" wp14:textId="5A24EB51">
       <w:pPr>
         <w:spacing w:after="120" w:line="300" w:lineRule="auto"/>
         <w:jc w:val="both"/>
@@ -156,7 +149,7 @@
         <w:pBdr>
           <w:bottom w:val="single" w:color="000000" w:sz="8" w:space="3"/>
         </w:pBdr>
-        <w:spacing w:before="180" w:after="130"/>
+        <w:spacing w:before="280" w:after="130"/>
       </w:pPr>
       <w:r>
         <w:rPr>
@@ -383,7 +376,7 @@
             </w:tcMar>
             <w:vAlign w:val="center"/>
           </w:tcPr>
-          <w:p wp14:textId="79BC4E98">
+          <w:p wp14:textId="77777777">
             <w:pPr>
               <w:jc w:val="left"/>
             </w:pPr>
@@ -394,8 +387,9 @@
                 <w:bCs w:val="0"/>
                 <w:sz w:val="19"/>
                 <w:szCs w:val="19"/>
-              </w:rPr>
-              <w:t>Segunda · 08/06</w:t>
+                <w:lang w:val="en-US"/>
+              </w:rPr>
+              <w:t>{dia_seg}</w:t>
             </w:r>
           </w:p>
         </w:tc>
@@ -416,24 +410,18 @@
             </w:tcMar>
             <w:vAlign w:val="center"/>
           </w:tcPr>
-          <w:p wp14:textId="02323AAF">
-            <w:pPr>
-              <w:jc w:val="center"/>
-              <w:rPr>
-                <w:rFonts w:ascii="Arial" w:hAnsi="Arial" w:eastAsia="Arial" w:cs="Arial"/>
-                <w:b w:val="0"/>
-                <w:bCs w:val="0"/>
-                <w:sz w:val="19"/>
-                <w:szCs w:val="19"/>
-              </w:rPr>
-            </w:pPr>
-            <w:r>
-              <w:rPr>
-                <w:rFonts w:ascii="Arial" w:hAnsi="Arial" w:eastAsia="Arial" w:cs="Arial"/>
-                <w:b w:val="0"/>
-                <w:bCs w:val="0"/>
-                <w:sz w:val="19"/>
-                <w:szCs w:val="19"/>
+          <w:p wp14:textId="77777777">
+            <w:pPr>
+              <w:jc w:val="center"/>
+            </w:pPr>
+            <w:r>
+              <w:rPr>
+                <w:rFonts w:ascii="Arial" w:hAnsi="Arial" w:eastAsia="Arial" w:cs="Arial"/>
+                <w:b w:val="0"/>
+                <w:bCs w:val="0"/>
+                <w:sz w:val="19"/>
+                <w:szCs w:val="19"/>
+                <w:lang w:val="en-US"/>
               </w:rPr>
               <w:t>{tx_seg}</w:t>
             </w:r>
@@ -456,24 +444,18 @@
             </w:tcMar>
             <w:vAlign w:val="center"/>
           </w:tcPr>
-          <w:p wp14:textId="63666194">
-            <w:pPr>
-              <w:jc w:val="center"/>
-              <w:rPr>
-                <w:rFonts w:ascii="Arial" w:hAnsi="Arial" w:eastAsia="Arial" w:cs="Arial"/>
-                <w:b w:val="0"/>
-                <w:bCs w:val="0"/>
-                <w:sz w:val="19"/>
-                <w:szCs w:val="19"/>
-              </w:rPr>
-            </w:pPr>
-            <w:r>
-              <w:rPr>
-                <w:rFonts w:ascii="Arial" w:hAnsi="Arial" w:eastAsia="Arial" w:cs="Arial"/>
-                <w:b w:val="0"/>
-                <w:bCs w:val="0"/>
-                <w:sz w:val="19"/>
-                <w:szCs w:val="19"/>
+          <w:p wp14:textId="77777777">
+            <w:pPr>
+              <w:jc w:val="center"/>
+            </w:pPr>
+            <w:r>
+              <w:rPr>
+                <w:rFonts w:ascii="Arial" w:hAnsi="Arial" w:eastAsia="Arial" w:cs="Arial"/>
+                <w:b w:val="0"/>
+                <w:bCs w:val="0"/>
+                <w:sz w:val="19"/>
+                <w:szCs w:val="19"/>
+                <w:lang w:val="en-US"/>
               </w:rPr>
               <w:t>{ret_seg}</w:t>
             </w:r>
@@ -496,24 +478,18 @@
             </w:tcMar>
             <w:vAlign w:val="center"/>
           </w:tcPr>
-          <w:p wp14:textId="1928B457">
-            <w:pPr>
-              <w:jc w:val="center"/>
-              <w:rPr>
-                <w:rFonts w:ascii="Arial" w:hAnsi="Arial" w:eastAsia="Arial" w:cs="Arial"/>
-                <w:b w:val="0"/>
-                <w:bCs w:val="0"/>
-                <w:sz w:val="19"/>
-                <w:szCs w:val="19"/>
-              </w:rPr>
-            </w:pPr>
-            <w:r>
-              <w:rPr>
-                <w:rFonts w:ascii="Arial" w:hAnsi="Arial" w:eastAsia="Arial" w:cs="Arial"/>
-                <w:b w:val="0"/>
-                <w:bCs w:val="0"/>
-                <w:sz w:val="19"/>
-                <w:szCs w:val="19"/>
+          <w:p wp14:textId="77777777">
+            <w:pPr>
+              <w:jc w:val="center"/>
+            </w:pPr>
+            <w:r>
+              <w:rPr>
+                <w:rFonts w:ascii="Arial" w:hAnsi="Arial" w:eastAsia="Arial" w:cs="Arial"/>
+                <w:b w:val="0"/>
+                <w:bCs w:val="0"/>
+                <w:sz w:val="19"/>
+                <w:szCs w:val="19"/>
+                <w:lang w:val="en-US"/>
               </w:rPr>
               <w:t>{canc_seg}</w:t>
             </w:r>
@@ -536,24 +512,18 @@
             </w:tcMar>
             <w:vAlign w:val="center"/>
           </w:tcPr>
-          <w:p wp14:textId="6AE37CB2">
-            <w:pPr>
-              <w:jc w:val="center"/>
-              <w:rPr>
-                <w:rFonts w:ascii="Arial" w:hAnsi="Arial" w:eastAsia="Arial" w:cs="Arial"/>
-                <w:b w:val="0"/>
-                <w:bCs w:val="0"/>
-                <w:sz w:val="19"/>
-                <w:szCs w:val="19"/>
-              </w:rPr>
-            </w:pPr>
-            <w:r>
-              <w:rPr>
-                <w:rFonts w:ascii="Arial" w:hAnsi="Arial" w:eastAsia="Arial" w:cs="Arial"/>
-                <w:b w:val="0"/>
-                <w:bCs w:val="0"/>
-                <w:sz w:val="19"/>
-                <w:szCs w:val="19"/>
+          <w:p wp14:textId="77777777">
+            <w:pPr>
+              <w:jc w:val="center"/>
+            </w:pPr>
+            <w:r>
+              <w:rPr>
+                <w:rFonts w:ascii="Arial" w:hAnsi="Arial" w:eastAsia="Arial" w:cs="Arial"/>
+                <w:b w:val="0"/>
+                <w:bCs w:val="0"/>
+                <w:sz w:val="19"/>
+                <w:szCs w:val="19"/>
+                <w:lang w:val="en-US"/>
               </w:rPr>
               <w:t>{ped_seg}</w:t>
             </w:r>
@@ -578,7 +548,7 @@
             </w:tcMar>
             <w:vAlign w:val="center"/>
           </w:tcPr>
-          <w:p wp14:textId="75B8D2C0">
+          <w:p wp14:textId="77777777">
             <w:pPr>
               <w:jc w:val="left"/>
             </w:pPr>
@@ -591,7 +561,7 @@
                 <w:szCs w:val="19"/>
                 <w:lang w:val="en-US"/>
               </w:rPr>
-              <w:t>Terça · 09/06</w:t>
+              <w:t>{dia_ter}</w:t>
             </w:r>
           </w:p>
         </w:tc>
@@ -612,24 +582,18 @@
             </w:tcMar>
             <w:vAlign w:val="center"/>
           </w:tcPr>
-          <w:p wp14:textId="4086DFC6">
-            <w:pPr>
-              <w:jc w:val="center"/>
-              <w:rPr>
-                <w:rFonts w:ascii="Arial" w:hAnsi="Arial" w:eastAsia="Arial" w:cs="Arial"/>
-                <w:b w:val="0"/>
-                <w:bCs w:val="0"/>
-                <w:sz w:val="19"/>
-                <w:szCs w:val="19"/>
-              </w:rPr>
-            </w:pPr>
-            <w:r>
-              <w:rPr>
-                <w:rFonts w:ascii="Arial" w:hAnsi="Arial" w:eastAsia="Arial" w:cs="Arial"/>
-                <w:b w:val="0"/>
-                <w:bCs w:val="0"/>
-                <w:sz w:val="19"/>
-                <w:szCs w:val="19"/>
+          <w:p wp14:textId="77777777">
+            <w:pPr>
+              <w:jc w:val="center"/>
+            </w:pPr>
+            <w:r>
+              <w:rPr>
+                <w:rFonts w:ascii="Arial" w:hAnsi="Arial" w:eastAsia="Arial" w:cs="Arial"/>
+                <w:b w:val="0"/>
+                <w:bCs w:val="0"/>
+                <w:sz w:val="19"/>
+                <w:szCs w:val="19"/>
+                <w:lang w:val="en-US"/>
               </w:rPr>
               <w:t>{tx_ter}</w:t>
             </w:r>
@@ -652,24 +616,18 @@
             </w:tcMar>
             <w:vAlign w:val="center"/>
           </w:tcPr>
-          <w:p wp14:textId="6E521A69">
-            <w:pPr>
-              <w:jc w:val="center"/>
-              <w:rPr>
-                <w:rFonts w:ascii="Arial" w:hAnsi="Arial" w:eastAsia="Arial" w:cs="Arial"/>
-                <w:b w:val="0"/>
-                <w:bCs w:val="0"/>
-                <w:sz w:val="19"/>
-                <w:szCs w:val="19"/>
-              </w:rPr>
-            </w:pPr>
-            <w:r>
-              <w:rPr>
-                <w:rFonts w:ascii="Arial" w:hAnsi="Arial" w:eastAsia="Arial" w:cs="Arial"/>
-                <w:b w:val="0"/>
-                <w:bCs w:val="0"/>
-                <w:sz w:val="19"/>
-                <w:szCs w:val="19"/>
+          <w:p wp14:textId="77777777">
+            <w:pPr>
+              <w:jc w:val="center"/>
+            </w:pPr>
+            <w:r>
+              <w:rPr>
+                <w:rFonts w:ascii="Arial" w:hAnsi="Arial" w:eastAsia="Arial" w:cs="Arial"/>
+                <w:b w:val="0"/>
+                <w:bCs w:val="0"/>
+                <w:sz w:val="19"/>
+                <w:szCs w:val="19"/>
+                <w:lang w:val="en-US"/>
               </w:rPr>
               <w:t>{ret_ter}</w:t>
             </w:r>
@@ -692,24 +650,18 @@
             </w:tcMar>
             <w:vAlign w:val="center"/>
           </w:tcPr>
-          <w:p wp14:textId="3781381A">
-            <w:pPr>
-              <w:jc w:val="center"/>
-              <w:rPr>
-                <w:rFonts w:ascii="Arial" w:hAnsi="Arial" w:eastAsia="Arial" w:cs="Arial"/>
-                <w:b w:val="0"/>
-                <w:bCs w:val="0"/>
-                <w:sz w:val="19"/>
-                <w:szCs w:val="19"/>
-              </w:rPr>
-            </w:pPr>
-            <w:r>
-              <w:rPr>
-                <w:rFonts w:ascii="Arial" w:hAnsi="Arial" w:eastAsia="Arial" w:cs="Arial"/>
-                <w:b w:val="0"/>
-                <w:bCs w:val="0"/>
-                <w:sz w:val="19"/>
-                <w:szCs w:val="19"/>
+          <w:p wp14:textId="77777777">
+            <w:pPr>
+              <w:jc w:val="center"/>
+            </w:pPr>
+            <w:r>
+              <w:rPr>
+                <w:rFonts w:ascii="Arial" w:hAnsi="Arial" w:eastAsia="Arial" w:cs="Arial"/>
+                <w:b w:val="0"/>
+                <w:bCs w:val="0"/>
+                <w:sz w:val="19"/>
+                <w:szCs w:val="19"/>
+                <w:lang w:val="en-US"/>
               </w:rPr>
               <w:t>{canc_ter}</w:t>
             </w:r>
@@ -732,24 +684,18 @@
             </w:tcMar>
             <w:vAlign w:val="center"/>
           </w:tcPr>
-          <w:p wp14:textId="7E64AEBC">
-            <w:pPr>
-              <w:jc w:val="center"/>
-              <w:rPr>
-                <w:rFonts w:ascii="Arial" w:hAnsi="Arial" w:eastAsia="Arial" w:cs="Arial"/>
-                <w:b w:val="0"/>
-                <w:bCs w:val="0"/>
-                <w:sz w:val="19"/>
-                <w:szCs w:val="19"/>
-              </w:rPr>
-            </w:pPr>
-            <w:r>
-              <w:rPr>
-                <w:rFonts w:ascii="Arial" w:hAnsi="Arial" w:eastAsia="Arial" w:cs="Arial"/>
-                <w:b w:val="0"/>
-                <w:bCs w:val="0"/>
-                <w:sz w:val="19"/>
-                <w:szCs w:val="19"/>
+          <w:p wp14:textId="77777777">
+            <w:pPr>
+              <w:jc w:val="center"/>
+            </w:pPr>
+            <w:r>
+              <w:rPr>
+                <w:rFonts w:ascii="Arial" w:hAnsi="Arial" w:eastAsia="Arial" w:cs="Arial"/>
+                <w:b w:val="0"/>
+                <w:bCs w:val="0"/>
+                <w:sz w:val="19"/>
+                <w:szCs w:val="19"/>
+                <w:lang w:val="en-US"/>
               </w:rPr>
               <w:t>{ped_ter}</w:t>
             </w:r>
@@ -774,26 +720,20 @@
             </w:tcMar>
             <w:vAlign w:val="center"/>
           </w:tcPr>
-          <w:p wp14:textId="036D20DC">
+          <w:p wp14:textId="77777777">
             <w:pPr>
               <w:jc w:val="left"/>
-              <w:rPr>
-                <w:rFonts w:ascii="Arial" w:hAnsi="Arial" w:eastAsia="Arial" w:cs="Arial"/>
-                <w:b w:val="0"/>
-                <w:bCs w:val="0"/>
-                <w:sz w:val="19"/>
-                <w:szCs w:val="19"/>
-              </w:rPr>
-            </w:pPr>
-            <w:r>
-              <w:rPr>
-                <w:rFonts w:ascii="Arial" w:hAnsi="Arial" w:eastAsia="Arial" w:cs="Arial"/>
-                <w:b w:val="0"/>
-                <w:bCs w:val="0"/>
-                <w:sz w:val="19"/>
-                <w:szCs w:val="19"/>
-              </w:rPr>
-              <w:t>Quarta · 10/06</w:t>
+            </w:pPr>
+            <w:r>
+              <w:rPr>
+                <w:rFonts w:ascii="Arial" w:hAnsi="Arial" w:eastAsia="Arial" w:cs="Arial"/>
+                <w:b w:val="0"/>
+                <w:bCs w:val="0"/>
+                <w:sz w:val="19"/>
+                <w:szCs w:val="19"/>
+                <w:lang w:val="en-US"/>
+              </w:rPr>
+              <w:t>{dia_qua}</w:t>
             </w:r>
           </w:p>
         </w:tc>
@@ -814,24 +754,18 @@
             </w:tcMar>
             <w:vAlign w:val="center"/>
           </w:tcPr>
-          <w:p wp14:textId="2112B8A9">
-            <w:pPr>
-              <w:jc w:val="center"/>
-              <w:rPr>
-                <w:rFonts w:ascii="Arial" w:hAnsi="Arial" w:eastAsia="Arial" w:cs="Arial"/>
-                <w:b w:val="0"/>
-                <w:bCs w:val="0"/>
-                <w:sz w:val="19"/>
-                <w:szCs w:val="19"/>
-              </w:rPr>
-            </w:pPr>
-            <w:r>
-              <w:rPr>
-                <w:rFonts w:ascii="Arial" w:hAnsi="Arial" w:eastAsia="Arial" w:cs="Arial"/>
-                <w:b w:val="0"/>
-                <w:bCs w:val="0"/>
-                <w:sz w:val="19"/>
-                <w:szCs w:val="19"/>
+          <w:p wp14:textId="77777777">
+            <w:pPr>
+              <w:jc w:val="center"/>
+            </w:pPr>
+            <w:r>
+              <w:rPr>
+                <w:rFonts w:ascii="Arial" w:hAnsi="Arial" w:eastAsia="Arial" w:cs="Arial"/>
+                <w:b w:val="0"/>
+                <w:bCs w:val="0"/>
+                <w:sz w:val="19"/>
+                <w:szCs w:val="19"/>
+                <w:lang w:val="en-US"/>
               </w:rPr>
               <w:t>{tx_qua}</w:t>
             </w:r>
@@ -854,24 +788,18 @@
             </w:tcMar>
             <w:vAlign w:val="center"/>
           </w:tcPr>
-          <w:p wp14:textId="708B4F56">
-            <w:pPr>
-              <w:jc w:val="center"/>
-              <w:rPr>
-                <w:rFonts w:ascii="Arial" w:hAnsi="Arial" w:eastAsia="Arial" w:cs="Arial"/>
-                <w:b w:val="0"/>
-                <w:bCs w:val="0"/>
-                <w:sz w:val="19"/>
-                <w:szCs w:val="19"/>
-              </w:rPr>
-            </w:pPr>
-            <w:r>
-              <w:rPr>
-                <w:rFonts w:ascii="Arial" w:hAnsi="Arial" w:eastAsia="Arial" w:cs="Arial"/>
-                <w:b w:val="0"/>
-                <w:bCs w:val="0"/>
-                <w:sz w:val="19"/>
-                <w:szCs w:val="19"/>
+          <w:p wp14:textId="77777777">
+            <w:pPr>
+              <w:jc w:val="center"/>
+            </w:pPr>
+            <w:r>
+              <w:rPr>
+                <w:rFonts w:ascii="Arial" w:hAnsi="Arial" w:eastAsia="Arial" w:cs="Arial"/>
+                <w:b w:val="0"/>
+                <w:bCs w:val="0"/>
+                <w:sz w:val="19"/>
+                <w:szCs w:val="19"/>
+                <w:lang w:val="en-US"/>
               </w:rPr>
               <w:t>{ret_qua}</w:t>
             </w:r>
@@ -894,24 +822,18 @@
             </w:tcMar>
             <w:vAlign w:val="center"/>
           </w:tcPr>
-          <w:p wp14:textId="6C9A0053">
-            <w:pPr>
-              <w:jc w:val="center"/>
-              <w:rPr>
-                <w:rFonts w:ascii="Arial" w:hAnsi="Arial" w:eastAsia="Arial" w:cs="Arial"/>
-                <w:b w:val="0"/>
-                <w:bCs w:val="0"/>
-                <w:sz w:val="19"/>
-                <w:szCs w:val="19"/>
-              </w:rPr>
-            </w:pPr>
-            <w:r>
-              <w:rPr>
-                <w:rFonts w:ascii="Arial" w:hAnsi="Arial" w:eastAsia="Arial" w:cs="Arial"/>
-                <w:b w:val="0"/>
-                <w:bCs w:val="0"/>
-                <w:sz w:val="19"/>
-                <w:szCs w:val="19"/>
+          <w:p wp14:textId="77777777">
+            <w:pPr>
+              <w:jc w:val="center"/>
+            </w:pPr>
+            <w:r>
+              <w:rPr>
+                <w:rFonts w:ascii="Arial" w:hAnsi="Arial" w:eastAsia="Arial" w:cs="Arial"/>
+                <w:b w:val="0"/>
+                <w:bCs w:val="0"/>
+                <w:sz w:val="19"/>
+                <w:szCs w:val="19"/>
+                <w:lang w:val="en-US"/>
               </w:rPr>
               <w:t>{canc_qua}</w:t>
             </w:r>
@@ -934,24 +856,18 @@
             </w:tcMar>
             <w:vAlign w:val="center"/>
           </w:tcPr>
-          <w:p wp14:textId="26551C90">
-            <w:pPr>
-              <w:jc w:val="center"/>
-              <w:rPr>
-                <w:rFonts w:ascii="Arial" w:hAnsi="Arial" w:eastAsia="Arial" w:cs="Arial"/>
-                <w:b w:val="0"/>
-                <w:bCs w:val="0"/>
-                <w:sz w:val="19"/>
-                <w:szCs w:val="19"/>
-              </w:rPr>
-            </w:pPr>
-            <w:r>
-              <w:rPr>
-                <w:rFonts w:ascii="Arial" w:hAnsi="Arial" w:eastAsia="Arial" w:cs="Arial"/>
-                <w:b w:val="0"/>
-                <w:bCs w:val="0"/>
-                <w:sz w:val="19"/>
-                <w:szCs w:val="19"/>
+          <w:p wp14:textId="77777777">
+            <w:pPr>
+              <w:jc w:val="center"/>
+            </w:pPr>
+            <w:r>
+              <w:rPr>
+                <w:rFonts w:ascii="Arial" w:hAnsi="Arial" w:eastAsia="Arial" w:cs="Arial"/>
+                <w:b w:val="0"/>
+                <w:bCs w:val="0"/>
+                <w:sz w:val="19"/>
+                <w:szCs w:val="19"/>
+                <w:lang w:val="en-US"/>
               </w:rPr>
               <w:t>{ped_qua}</w:t>
             </w:r>
@@ -976,13 +892,8 @@
             </w:tcMar>
             <w:vAlign w:val="center"/>
           </w:tcPr>
-          <w:p wp14:textId="12478A19">
-            <w:pPr>
-              <w:pStyle w:val="Normal"/>
-              <w:suppressLineNumbers w:val="0"/>
-              <w:bidi w:val="0"/>
-              <w:spacing w:before="0" w:beforeAutospacing="off" w:after="0" w:afterAutospacing="off" w:line="259" w:lineRule="auto"/>
-              <w:ind w:left="0" w:right="0"/>
+          <w:p wp14:textId="77777777">
+            <w:pPr>
               <w:jc w:val="left"/>
             </w:pPr>
             <w:r>
@@ -992,8 +903,9 @@
                 <w:bCs w:val="0"/>
                 <w:sz w:val="19"/>
                 <w:szCs w:val="19"/>
-              </w:rPr>
-              <w:t>Quinta · 11/06</w:t>
+                <w:lang w:val="en-US"/>
+              </w:rPr>
+              <w:t>{dia_qui}</w:t>
             </w:r>
           </w:p>
         </w:tc>
@@ -1014,24 +926,18 @@
             </w:tcMar>
             <w:vAlign w:val="center"/>
           </w:tcPr>
-          <w:p wp14:textId="293DE972">
-            <w:pPr>
-              <w:jc w:val="center"/>
-              <w:rPr>
-                <w:rFonts w:ascii="Arial" w:hAnsi="Arial" w:eastAsia="Arial" w:cs="Arial"/>
-                <w:b w:val="0"/>
-                <w:bCs w:val="0"/>
-                <w:sz w:val="19"/>
-                <w:szCs w:val="19"/>
-              </w:rPr>
-            </w:pPr>
-            <w:r>
-              <w:rPr>
-                <w:rFonts w:ascii="Arial" w:hAnsi="Arial" w:eastAsia="Arial" w:cs="Arial"/>
-                <w:b w:val="0"/>
-                <w:bCs w:val="0"/>
-                <w:sz w:val="19"/>
-                <w:szCs w:val="19"/>
+          <w:p wp14:textId="77777777">
+            <w:pPr>
+              <w:jc w:val="center"/>
+            </w:pPr>
+            <w:r>
+              <w:rPr>
+                <w:rFonts w:ascii="Arial" w:hAnsi="Arial" w:eastAsia="Arial" w:cs="Arial"/>
+                <w:b w:val="0"/>
+                <w:bCs w:val="0"/>
+                <w:sz w:val="19"/>
+                <w:szCs w:val="19"/>
+                <w:lang w:val="en-US"/>
               </w:rPr>
               <w:t>{tx_qui}</w:t>
             </w:r>
@@ -1054,24 +960,18 @@
             </w:tcMar>
             <w:vAlign w:val="center"/>
           </w:tcPr>
-          <w:p wp14:textId="79EC3F4A">
-            <w:pPr>
-              <w:jc w:val="center"/>
-              <w:rPr>
-                <w:rFonts w:ascii="Arial" w:hAnsi="Arial" w:eastAsia="Arial" w:cs="Arial"/>
-                <w:b w:val="0"/>
-                <w:bCs w:val="0"/>
-                <w:sz w:val="19"/>
-                <w:szCs w:val="19"/>
-              </w:rPr>
-            </w:pPr>
-            <w:r>
-              <w:rPr>
-                <w:rFonts w:ascii="Arial" w:hAnsi="Arial" w:eastAsia="Arial" w:cs="Arial"/>
-                <w:b w:val="0"/>
-                <w:bCs w:val="0"/>
-                <w:sz w:val="19"/>
-                <w:szCs w:val="19"/>
+          <w:p wp14:textId="77777777">
+            <w:pPr>
+              <w:jc w:val="center"/>
+            </w:pPr>
+            <w:r>
+              <w:rPr>
+                <w:rFonts w:ascii="Arial" w:hAnsi="Arial" w:eastAsia="Arial" w:cs="Arial"/>
+                <w:b w:val="0"/>
+                <w:bCs w:val="0"/>
+                <w:sz w:val="19"/>
+                <w:szCs w:val="19"/>
+                <w:lang w:val="en-US"/>
               </w:rPr>
               <w:t>{ret_qui}</w:t>
             </w:r>
@@ -1094,24 +994,18 @@
             </w:tcMar>
             <w:vAlign w:val="center"/>
           </w:tcPr>
-          <w:p wp14:textId="493AB0D8">
-            <w:pPr>
-              <w:jc w:val="center"/>
-              <w:rPr>
-                <w:rFonts w:ascii="Arial" w:hAnsi="Arial" w:eastAsia="Arial" w:cs="Arial"/>
-                <w:b w:val="0"/>
-                <w:bCs w:val="0"/>
-                <w:sz w:val="19"/>
-                <w:szCs w:val="19"/>
-              </w:rPr>
-            </w:pPr>
-            <w:r>
-              <w:rPr>
-                <w:rFonts w:ascii="Arial" w:hAnsi="Arial" w:eastAsia="Arial" w:cs="Arial"/>
-                <w:b w:val="0"/>
-                <w:bCs w:val="0"/>
-                <w:sz w:val="19"/>
-                <w:szCs w:val="19"/>
+          <w:p wp14:textId="77777777">
+            <w:pPr>
+              <w:jc w:val="center"/>
+            </w:pPr>
+            <w:r>
+              <w:rPr>
+                <w:rFonts w:ascii="Arial" w:hAnsi="Arial" w:eastAsia="Arial" w:cs="Arial"/>
+                <w:b w:val="0"/>
+                <w:bCs w:val="0"/>
+                <w:sz w:val="19"/>
+                <w:szCs w:val="19"/>
+                <w:lang w:val="en-US"/>
               </w:rPr>
               <w:t>{canc_qui}</w:t>
             </w:r>
@@ -1134,24 +1028,18 @@
             </w:tcMar>
             <w:vAlign w:val="center"/>
           </w:tcPr>
-          <w:p wp14:textId="7D068F6E">
-            <w:pPr>
-              <w:jc w:val="center"/>
-              <w:rPr>
-                <w:rFonts w:ascii="Arial" w:hAnsi="Arial" w:eastAsia="Arial" w:cs="Arial"/>
-                <w:b w:val="0"/>
-                <w:bCs w:val="0"/>
-                <w:sz w:val="19"/>
-                <w:szCs w:val="19"/>
-              </w:rPr>
-            </w:pPr>
-            <w:r>
-              <w:rPr>
-                <w:rFonts w:ascii="Arial" w:hAnsi="Arial" w:eastAsia="Arial" w:cs="Arial"/>
-                <w:b w:val="0"/>
-                <w:bCs w:val="0"/>
-                <w:sz w:val="19"/>
-                <w:szCs w:val="19"/>
+          <w:p wp14:textId="77777777">
+            <w:pPr>
+              <w:jc w:val="center"/>
+            </w:pPr>
+            <w:r>
+              <w:rPr>
+                <w:rFonts w:ascii="Arial" w:hAnsi="Arial" w:eastAsia="Arial" w:cs="Arial"/>
+                <w:b w:val="0"/>
+                <w:bCs w:val="0"/>
+                <w:sz w:val="19"/>
+                <w:szCs w:val="19"/>
+                <w:lang w:val="en-US"/>
               </w:rPr>
               <w:t>{ped_qui}</w:t>
             </w:r>
@@ -1176,12 +1064,8 @@
             </w:tcMar>
             <w:vAlign w:val="center"/>
           </w:tcPr>
-          <w:p wp14:textId="00F1F568">
-            <w:pPr>
-              <w:pStyle w:val="Normal"/>
-              <w:suppressLineNumbers w:val="0"/>
-              <w:spacing w:before="0" w:beforeAutospacing="off" w:after="0" w:afterAutospacing="off" w:line="259" w:lineRule="auto"/>
-              <w:ind w:left="0" w:right="0"/>
+          <w:p wp14:textId="77777777">
+            <w:pPr>
               <w:jc w:val="left"/>
             </w:pPr>
             <w:r>
@@ -1191,8 +1075,9 @@
                 <w:bCs w:val="0"/>
                 <w:sz w:val="19"/>
                 <w:szCs w:val="19"/>
-              </w:rPr>
-              <w:t>Sexta · 12/06</w:t>
+                <w:lang w:val="en-US"/>
+              </w:rPr>
+              <w:t>{dia_sex}</w:t>
             </w:r>
           </w:p>
         </w:tc>
@@ -1213,29 +1098,18 @@
             </w:tcMar>
             <w:vAlign w:val="center"/>
           </w:tcPr>
-          <w:p wp14:textId="3A2B3004">
-            <w:pPr>
-              <w:pStyle w:val="Normal"/>
-              <w:suppressLineNumbers w:val="0"/>
-              <w:bidi w:val="0"/>
-              <w:spacing w:before="0" w:beforeAutospacing="off" w:after="0" w:afterAutospacing="off" w:line="259" w:lineRule="auto"/>
-              <w:ind w:left="0" w:right="0"/>
-              <w:jc w:val="center"/>
-              <w:rPr>
-                <w:rFonts w:ascii="Arial" w:hAnsi="Arial" w:eastAsia="Arial" w:cs="Arial"/>
-                <w:b w:val="0"/>
-                <w:bCs w:val="0"/>
-                <w:sz w:val="19"/>
-                <w:szCs w:val="19"/>
-              </w:rPr>
-            </w:pPr>
-            <w:r>
-              <w:rPr>
-                <w:rFonts w:ascii="Arial" w:hAnsi="Arial" w:eastAsia="Arial" w:cs="Arial"/>
-                <w:b w:val="0"/>
-                <w:bCs w:val="0"/>
-                <w:sz w:val="19"/>
-                <w:szCs w:val="19"/>
+          <w:p wp14:textId="77777777">
+            <w:pPr>
+              <w:jc w:val="center"/>
+            </w:pPr>
+            <w:r>
+              <w:rPr>
+                <w:rFonts w:ascii="Arial" w:hAnsi="Arial" w:eastAsia="Arial" w:cs="Arial"/>
+                <w:b w:val="0"/>
+                <w:bCs w:val="0"/>
+                <w:sz w:val="19"/>
+                <w:szCs w:val="19"/>
+                <w:lang w:val="en-US"/>
               </w:rPr>
               <w:t>{tx_sex}</w:t>
             </w:r>
@@ -1258,29 +1132,18 @@
             </w:tcMar>
             <w:vAlign w:val="center"/>
           </w:tcPr>
-          <w:p wp14:textId="2B040712">
-            <w:pPr>
-              <w:pStyle w:val="Normal"/>
-              <w:suppressLineNumbers w:val="0"/>
-              <w:bidi w:val="0"/>
-              <w:spacing w:before="0" w:beforeAutospacing="off" w:after="0" w:afterAutospacing="off" w:line="259" w:lineRule="auto"/>
-              <w:ind w:left="0" w:right="0"/>
-              <w:jc w:val="center"/>
-              <w:rPr>
-                <w:rFonts w:ascii="Arial" w:hAnsi="Arial" w:eastAsia="Arial" w:cs="Arial"/>
-                <w:b w:val="0"/>
-                <w:bCs w:val="0"/>
-                <w:sz w:val="19"/>
-                <w:szCs w:val="19"/>
-              </w:rPr>
-            </w:pPr>
-            <w:r>
-              <w:rPr>
-                <w:rFonts w:ascii="Arial" w:hAnsi="Arial" w:eastAsia="Arial" w:cs="Arial"/>
-                <w:b w:val="0"/>
-                <w:bCs w:val="0"/>
-                <w:sz w:val="19"/>
-                <w:szCs w:val="19"/>
+          <w:p wp14:textId="77777777">
+            <w:pPr>
+              <w:jc w:val="center"/>
+            </w:pPr>
+            <w:r>
+              <w:rPr>
+                <w:rFonts w:ascii="Arial" w:hAnsi="Arial" w:eastAsia="Arial" w:cs="Arial"/>
+                <w:b w:val="0"/>
+                <w:bCs w:val="0"/>
+                <w:sz w:val="19"/>
+                <w:szCs w:val="19"/>
+                <w:lang w:val="en-US"/>
               </w:rPr>
               <w:t>{ret_sex}</w:t>
             </w:r>
@@ -1303,29 +1166,18 @@
             </w:tcMar>
             <w:vAlign w:val="center"/>
           </w:tcPr>
-          <w:p wp14:textId="54167476">
-            <w:pPr>
-              <w:pStyle w:val="Normal"/>
-              <w:suppressLineNumbers w:val="0"/>
-              <w:bidi w:val="0"/>
-              <w:spacing w:before="0" w:beforeAutospacing="off" w:after="0" w:afterAutospacing="off" w:line="259" w:lineRule="auto"/>
-              <w:ind w:left="0" w:right="0"/>
-              <w:jc w:val="center"/>
-              <w:rPr>
-                <w:rFonts w:ascii="Arial" w:hAnsi="Arial" w:eastAsia="Arial" w:cs="Arial"/>
-                <w:b w:val="0"/>
-                <w:bCs w:val="0"/>
-                <w:sz w:val="19"/>
-                <w:szCs w:val="19"/>
-              </w:rPr>
-            </w:pPr>
-            <w:r>
-              <w:rPr>
-                <w:rFonts w:ascii="Arial" w:hAnsi="Arial" w:eastAsia="Arial" w:cs="Arial"/>
-                <w:b w:val="0"/>
-                <w:bCs w:val="0"/>
-                <w:sz w:val="19"/>
-                <w:szCs w:val="19"/>
+          <w:p wp14:textId="77777777">
+            <w:pPr>
+              <w:jc w:val="center"/>
+            </w:pPr>
+            <w:r>
+              <w:rPr>
+                <w:rFonts w:ascii="Arial" w:hAnsi="Arial" w:eastAsia="Arial" w:cs="Arial"/>
+                <w:b w:val="0"/>
+                <w:bCs w:val="0"/>
+                <w:sz w:val="19"/>
+                <w:szCs w:val="19"/>
+                <w:lang w:val="en-US"/>
               </w:rPr>
               <w:t>{canc_sex}</w:t>
             </w:r>
@@ -1348,29 +1200,18 @@
             </w:tcMar>
             <w:vAlign w:val="center"/>
           </w:tcPr>
-          <w:p wp14:textId="23B4CE14">
-            <w:pPr>
-              <w:pStyle w:val="Normal"/>
-              <w:suppressLineNumbers w:val="0"/>
-              <w:bidi w:val="0"/>
-              <w:spacing w:before="0" w:beforeAutospacing="off" w:after="0" w:afterAutospacing="off" w:line="259" w:lineRule="auto"/>
-              <w:ind w:left="0" w:right="0"/>
-              <w:jc w:val="center"/>
-              <w:rPr>
-                <w:rFonts w:ascii="Arial" w:hAnsi="Arial" w:eastAsia="Arial" w:cs="Arial"/>
-                <w:b w:val="0"/>
-                <w:bCs w:val="0"/>
-                <w:sz w:val="19"/>
-                <w:szCs w:val="19"/>
-              </w:rPr>
-            </w:pPr>
-            <w:r>
-              <w:rPr>
-                <w:rFonts w:ascii="Arial" w:hAnsi="Arial" w:eastAsia="Arial" w:cs="Arial"/>
-                <w:b w:val="0"/>
-                <w:bCs w:val="0"/>
-                <w:sz w:val="19"/>
-                <w:szCs w:val="19"/>
+          <w:p wp14:textId="77777777">
+            <w:pPr>
+              <w:jc w:val="center"/>
+            </w:pPr>
+            <w:r>
+              <w:rPr>
+                <w:rFonts w:ascii="Arial" w:hAnsi="Arial" w:eastAsia="Arial" w:cs="Arial"/>
+                <w:b w:val="0"/>
+                <w:bCs w:val="0"/>
+                <w:sz w:val="19"/>
+                <w:szCs w:val="19"/>
+                <w:lang w:val="en-US"/>
               </w:rPr>
               <w:t>{ped_sex}</w:t>
             </w:r>
@@ -1395,13 +1236,8 @@
             </w:tcMar>
             <w:vAlign w:val="center"/>
           </w:tcPr>
-          <w:p wp14:textId="65639984">
-            <w:pPr>
-              <w:pStyle w:val="Normal"/>
-              <w:suppressLineNumbers w:val="0"/>
-              <w:bidi w:val="0"/>
-              <w:spacing w:before="0" w:beforeAutospacing="off" w:after="0" w:afterAutospacing="off" w:line="259" w:lineRule="auto"/>
-              <w:ind w:left="0" w:right="0"/>
+          <w:p wp14:textId="77777777">
+            <w:pPr>
               <w:jc w:val="left"/>
             </w:pPr>
             <w:r>
@@ -1411,8 +1247,9 @@
                 <w:bCs w:val="0"/>
                 <w:sz w:val="19"/>
                 <w:szCs w:val="19"/>
-              </w:rPr>
-              <w:t>Sábado · 13/06</w:t>
+                <w:lang w:val="en-US"/>
+              </w:rPr>
+              <w:t>{dia_sab}</w:t>
             </w:r>
           </w:p>
         </w:tc>
@@ -1433,24 +1270,18 @@
             </w:tcMar>
             <w:vAlign w:val="center"/>
           </w:tcPr>
-          <w:p wp14:textId="437FBC34">
-            <w:pPr>
-              <w:jc w:val="center"/>
-              <w:rPr>
-                <w:rFonts w:ascii="Arial" w:hAnsi="Arial" w:eastAsia="Arial" w:cs="Arial"/>
-                <w:b w:val="0"/>
-                <w:bCs w:val="0"/>
-                <w:sz w:val="19"/>
-                <w:szCs w:val="19"/>
-              </w:rPr>
-            </w:pPr>
-            <w:r>
-              <w:rPr>
-                <w:rFonts w:ascii="Arial" w:hAnsi="Arial" w:eastAsia="Arial" w:cs="Arial"/>
-                <w:b w:val="0"/>
-                <w:bCs w:val="0"/>
-                <w:sz w:val="19"/>
-                <w:szCs w:val="19"/>
+          <w:p wp14:textId="77777777">
+            <w:pPr>
+              <w:jc w:val="center"/>
+            </w:pPr>
+            <w:r>
+              <w:rPr>
+                <w:rFonts w:ascii="Arial" w:hAnsi="Arial" w:eastAsia="Arial" w:cs="Arial"/>
+                <w:b w:val="0"/>
+                <w:bCs w:val="0"/>
+                <w:sz w:val="19"/>
+                <w:szCs w:val="19"/>
+                <w:lang w:val="en-US"/>
               </w:rPr>
               <w:t>{tx_sab}</w:t>
             </w:r>
@@ -1473,24 +1304,18 @@
             </w:tcMar>
             <w:vAlign w:val="center"/>
           </w:tcPr>
-          <w:p wp14:textId="05A195D6">
-            <w:pPr>
-              <w:jc w:val="center"/>
-              <w:rPr>
-                <w:rFonts w:ascii="Arial" w:hAnsi="Arial" w:eastAsia="Arial" w:cs="Arial"/>
-                <w:b w:val="0"/>
-                <w:bCs w:val="0"/>
-                <w:sz w:val="19"/>
-                <w:szCs w:val="19"/>
-              </w:rPr>
-            </w:pPr>
-            <w:r>
-              <w:rPr>
-                <w:rFonts w:ascii="Arial" w:hAnsi="Arial" w:eastAsia="Arial" w:cs="Arial"/>
-                <w:b w:val="0"/>
-                <w:bCs w:val="0"/>
-                <w:sz w:val="19"/>
-                <w:szCs w:val="19"/>
+          <w:p wp14:textId="77777777">
+            <w:pPr>
+              <w:jc w:val="center"/>
+            </w:pPr>
+            <w:r>
+              <w:rPr>
+                <w:rFonts w:ascii="Arial" w:hAnsi="Arial" w:eastAsia="Arial" w:cs="Arial"/>
+                <w:b w:val="0"/>
+                <w:bCs w:val="0"/>
+                <w:sz w:val="19"/>
+                <w:szCs w:val="19"/>
+                <w:lang w:val="en-US"/>
               </w:rPr>
               <w:t>{ret_sab}</w:t>
             </w:r>
@@ -1513,24 +1338,18 @@
             </w:tcMar>
             <w:vAlign w:val="center"/>
           </w:tcPr>
-          <w:p wp14:textId="5236C27D">
-            <w:pPr>
-              <w:jc w:val="center"/>
-              <w:rPr>
-                <w:rFonts w:ascii="Arial" w:hAnsi="Arial" w:eastAsia="Arial" w:cs="Arial"/>
-                <w:b w:val="0"/>
-                <w:bCs w:val="0"/>
-                <w:sz w:val="19"/>
-                <w:szCs w:val="19"/>
-              </w:rPr>
-            </w:pPr>
-            <w:r>
-              <w:rPr>
-                <w:rFonts w:ascii="Arial" w:hAnsi="Arial" w:eastAsia="Arial" w:cs="Arial"/>
-                <w:b w:val="0"/>
-                <w:bCs w:val="0"/>
-                <w:sz w:val="19"/>
-                <w:szCs w:val="19"/>
+          <w:p wp14:textId="77777777">
+            <w:pPr>
+              <w:jc w:val="center"/>
+            </w:pPr>
+            <w:r>
+              <w:rPr>
+                <w:rFonts w:ascii="Arial" w:hAnsi="Arial" w:eastAsia="Arial" w:cs="Arial"/>
+                <w:b w:val="0"/>
+                <w:bCs w:val="0"/>
+                <w:sz w:val="19"/>
+                <w:szCs w:val="19"/>
+                <w:lang w:val="en-US"/>
               </w:rPr>
               <w:t>{canc_sab}</w:t>
             </w:r>
@@ -1553,24 +1372,18 @@
             </w:tcMar>
             <w:vAlign w:val="center"/>
           </w:tcPr>
-          <w:p wp14:textId="13AE5DA4">
-            <w:pPr>
-              <w:jc w:val="center"/>
-              <w:rPr>
-                <w:rFonts w:ascii="Arial" w:hAnsi="Arial" w:eastAsia="Arial" w:cs="Arial"/>
-                <w:b w:val="0"/>
-                <w:bCs w:val="0"/>
-                <w:sz w:val="19"/>
-                <w:szCs w:val="19"/>
-              </w:rPr>
-            </w:pPr>
-            <w:r>
-              <w:rPr>
-                <w:rFonts w:ascii="Arial" w:hAnsi="Arial" w:eastAsia="Arial" w:cs="Arial"/>
-                <w:b w:val="0"/>
-                <w:bCs w:val="0"/>
-                <w:sz w:val="19"/>
-                <w:szCs w:val="19"/>
+          <w:p wp14:textId="77777777">
+            <w:pPr>
+              <w:jc w:val="center"/>
+            </w:pPr>
+            <w:r>
+              <w:rPr>
+                <w:rFonts w:ascii="Arial" w:hAnsi="Arial" w:eastAsia="Arial" w:cs="Arial"/>
+                <w:b w:val="0"/>
+                <w:bCs w:val="0"/>
+                <w:sz w:val="19"/>
+                <w:szCs w:val="19"/>
+                <w:lang w:val="en-US"/>
               </w:rPr>
               <w:t>{ped_sab}</w:t>
             </w:r>
@@ -1628,24 +1441,18 @@
             </w:tcMar>
             <w:vAlign w:val="center"/>
           </w:tcPr>
-          <w:p wp14:textId="30D0EBF0">
-            <w:pPr>
-              <w:jc w:val="center"/>
+          <w:p wp14:textId="77777777">
+            <w:pPr>
+              <w:jc w:val="center"/>
+            </w:pPr>
+            <w:r>
               <w:rPr>
                 <w:rFonts w:ascii="Arial" w:hAnsi="Arial" w:eastAsia="Arial" w:cs="Arial"/>
                 <w:b w:val="1"/>
                 <w:bCs w:val="1"/>
                 <w:sz w:val="19"/>
                 <w:szCs w:val="19"/>
-              </w:rPr>
-            </w:pPr>
-            <w:r>
-              <w:rPr>
-                <w:rFonts w:ascii="Arial" w:hAnsi="Arial" w:eastAsia="Arial" w:cs="Arial"/>
-                <w:b w:val="0"/>
-                <w:bCs w:val="0"/>
-                <w:sz w:val="19"/>
-                <w:szCs w:val="19"/>
+                <w:lang w:val="en-US"/>
               </w:rPr>
               <w:t>{tx_total}</w:t>
             </w:r>
@@ -1668,24 +1475,18 @@
             </w:tcMar>
             <w:vAlign w:val="center"/>
           </w:tcPr>
-          <w:p wp14:textId="6590F0B9">
-            <w:pPr>
-              <w:jc w:val="center"/>
+          <w:p wp14:textId="77777777">
+            <w:pPr>
+              <w:jc w:val="center"/>
+            </w:pPr>
+            <w:r>
               <w:rPr>
                 <w:rFonts w:ascii="Arial" w:hAnsi="Arial" w:eastAsia="Arial" w:cs="Arial"/>
                 <w:b w:val="1"/>
                 <w:bCs w:val="1"/>
                 <w:sz w:val="19"/>
                 <w:szCs w:val="19"/>
-              </w:rPr>
-            </w:pPr>
-            <w:r>
-              <w:rPr>
-                <w:rFonts w:ascii="Arial" w:hAnsi="Arial" w:eastAsia="Arial" w:cs="Arial"/>
-                <w:b w:val="0"/>
-                <w:bCs w:val="0"/>
-                <w:sz w:val="19"/>
-                <w:szCs w:val="19"/>
+                <w:lang w:val="en-US"/>
               </w:rPr>
               <w:t>{ret_total}</w:t>
             </w:r>
@@ -1708,24 +1509,18 @@
             </w:tcMar>
             <w:vAlign w:val="center"/>
           </w:tcPr>
-          <w:p wp14:textId="352A2308">
-            <w:pPr>
-              <w:jc w:val="center"/>
+          <w:p wp14:textId="77777777">
+            <w:pPr>
+              <w:jc w:val="center"/>
+            </w:pPr>
+            <w:r>
               <w:rPr>
                 <w:rFonts w:ascii="Arial" w:hAnsi="Arial" w:eastAsia="Arial" w:cs="Arial"/>
                 <w:b w:val="1"/>
                 <w:bCs w:val="1"/>
                 <w:sz w:val="19"/>
                 <w:szCs w:val="19"/>
-              </w:rPr>
-            </w:pPr>
-            <w:r>
-              <w:rPr>
-                <w:rFonts w:ascii="Arial" w:hAnsi="Arial" w:eastAsia="Arial" w:cs="Arial"/>
-                <w:b w:val="0"/>
-                <w:bCs w:val="0"/>
-                <w:sz w:val="19"/>
-                <w:szCs w:val="19"/>
+                <w:lang w:val="en-US"/>
               </w:rPr>
               <w:t>{canc_total}</w:t>
             </w:r>
@@ -1748,24 +1543,18 @@
             </w:tcMar>
             <w:vAlign w:val="center"/>
           </w:tcPr>
-          <w:p wp14:textId="45983CAA">
-            <w:pPr>
-              <w:jc w:val="center"/>
+          <w:p wp14:textId="77777777">
+            <w:pPr>
+              <w:jc w:val="center"/>
+            </w:pPr>
+            <w:r>
               <w:rPr>
                 <w:rFonts w:ascii="Arial" w:hAnsi="Arial" w:eastAsia="Arial" w:cs="Arial"/>
                 <w:b w:val="1"/>
                 <w:bCs w:val="1"/>
                 <w:sz w:val="19"/>
                 <w:szCs w:val="19"/>
-              </w:rPr>
-            </w:pPr>
-            <w:r>
-              <w:rPr>
-                <w:rFonts w:ascii="Arial" w:hAnsi="Arial" w:eastAsia="Arial" w:cs="Arial"/>
-                <w:b w:val="0"/>
-                <w:bCs w:val="0"/>
-                <w:sz w:val="19"/>
-                <w:szCs w:val="19"/>
+                <w:lang w:val="en-US"/>
               </w:rPr>
               <w:t>{ped_total}</w:t>
             </w:r>
@@ -1773,12 +1562,12 @@
         </w:tc>
       </w:tr>
     </w:tbl>
-    <w:p xmlns:wp14="http://schemas.microsoft.com/office/word/2010/wordml" wp14:textId="157B445B">
+    <w:p>
       <w:pPr>
         <w:pBdr>
           <w:bottom w:val="single" w:color="000000" w:sz="8" w:space="3"/>
         </w:pBdr>
-        <w:spacing w:before="180" w:after="130"/>
+        <w:spacing w:before="280" w:after="130"/>
         <w:rPr>
           <w:rFonts w:ascii="Arial" w:hAnsi="Arial" w:eastAsia="Arial" w:cs="Arial"/>
           <w:b w:val="1"/>
@@ -1790,19 +1579,60 @@
         </w:rPr>
       </w:pPr>
       <w:r>
+        <w:rPr>
+          <w:rFonts w:ascii="Arial" w:hAnsi="Arial" w:eastAsia="Arial" w:cs="Arial"/>
+          <w:b w:val="1"/>
+          <w:bCs w:val="1"/>
+          <w:caps w:val="1"/>
+          <w:sz w:val="22"/>
+          <w:szCs w:val="22"/>
+          <w:lang w:val="en-US"/>
+        </w:rPr>
+        <w:t xml:space="preserve"> </w:t>
+      </w:r>
+      <w:r>
         <w:br/>
+      </w:r>
+      <w:r>
         <w:br/>
+      </w:r>
+      <w:r>
         <w:br/>
+      </w:r>
+      <w:r>
         <w:br/>
+      </w:r>
+      <w:r>
         <w:br/>
+      </w:r>
+      <w:r>
         <w:br/>
+      </w:r>
+    </w:p>
+    <w:p>
+      <w:pPr>
+        <w:pStyle w:val="Normal"/>
+        <w:pBdr>
+          <w:bottom w:val="single" w:color="000000" w:sz="8" w:space="3"/>
+        </w:pBdr>
+        <w:spacing w:before="280" w:after="130"/>
+        <w:rPr>
+          <w:rFonts w:ascii="Arial" w:hAnsi="Arial" w:eastAsia="Arial" w:cs="Arial"/>
+          <w:b w:val="1"/>
+          <w:bCs w:val="1"/>
+          <w:caps w:val="1"/>
+          <w:sz w:val="22"/>
+          <w:szCs w:val="22"/>
+          <w:lang w:val="en-US"/>
+        </w:rPr>
+      </w:pPr>
+      <w:r>
         <w:br/>
+      </w:r>
+      <w:r>
         <w:br/>
-        <w:br/>
-        <w:br/>
-        <w:br/>
-        <w:br/>
-        <w:br/>
+      </w:r>
+      <w:r>
         <w:br/>
       </w:r>
     </w:p>
@@ -1827,7 +1657,7 @@
         <w:pBdr>
           <w:bottom w:val="single" w:color="000000" w:sz="6" w:space="1"/>
         </w:pBdr>
-        <w:spacing w:before="360"/>
+        <w:spacing w:before="620"/>
       </w:pPr>
       <w:r>
         <w:rPr>
@@ -1836,10 +1666,12 @@
         </w:rPr>
       </w:r>
     </w:p>
-    <w:p xmlns:wp14="http://schemas.microsoft.com/office/word/2010/wordml" wp14:textId="086E7F6E">
+    <w:p xmlns:wp14="http://schemas.microsoft.com/office/word/2010/wordml" wp14:textId="77777777">
       <w:pPr>
         <w:spacing w:before="70" w:after="0"/>
         <w:jc w:val="center"/>
+      </w:pPr>
+      <w:r>
         <w:rPr>
           <w:rFonts w:ascii="Arial" w:hAnsi="Arial" w:eastAsia="Arial" w:cs="Arial"/>
           <w:color w:val="404040"/>
@@ -1847,33 +1679,24 @@
           <w:szCs w:val="18"/>
           <w:lang w:val="en-US"/>
         </w:rPr>
-      </w:pPr>
-      <w:r>
-        <w:rPr>
-          <w:rFonts w:ascii="Arial" w:hAnsi="Arial" w:eastAsia="Arial" w:cs="Arial"/>
-          <w:color w:val="404040"/>
-          <w:sz w:val="18"/>
-          <w:szCs w:val="18"/>
-          <w:lang w:val="en-US"/>
-        </w:rPr>
-        <w:t xml:space="preserve">Assinatura do Operador  —  {operador}</w:t>
+        <w:t>Assinatura do Operador  —  {operador}</w:t>
       </w:r>
     </w:p>
     <w:sectPr>
       <w:headerReference w:type="default" r:id="rId7"/>
       <w:pgSz w:w="11906" w:h="16838" w:orient="portrait"/>
-      <w:pgMar w:top="680" w:right="1800" w:bottom="567" w:left="1800" w:header="708" w:footer="708" w:gutter="0"/>
+      <w:pgMar w:top="1000" w:right="1800" w:bottom="1000" w:left="1800" w:header="708" w:footer="708" w:gutter="0"/>
       <w:pgNumType/>
       <w:docGrid w:linePitch="360"/>
       <w:cols w:num="1"/>
-      <w:footerReference w:type="default" r:id="R7d28297bb6854530"/>
+      <w:footerReference w:type="default" r:id="R696b45ce83494db1"/>
     </w:sectPr>
   </w:body>
 </w:document>
 </file>
 
 <file path=word/footer.xml><?xml version="1.0" encoding="utf-8"?>
-<w:ftr xmlns:w14="http://schemas.microsoft.com/office/word/2010/wordml" xmlns:w="http://schemas.openxmlformats.org/wordprocessingml/2006/main">
+<w:ftr xmlns:wp14="http://schemas.microsoft.com/office/word/2010/wordprocessingDrawing" xmlns:w14="http://schemas.microsoft.com/office/word/2010/wordml" xmlns:w="http://schemas.openxmlformats.org/wordprocessingml/2006/main" xmlns:mc="http://schemas.openxmlformats.org/markup-compatibility/2006" mc:Ignorable="wp14">
   <w:tbl>
     <w:tblPr>
       <w:tblStyle w:val="TableNormal"/>
@@ -1886,7 +1709,7 @@
       <w:gridCol w:w="2765"/>
       <w:gridCol w:w="2765"/>
     </w:tblGrid>
-    <w:tr>
+    <w:tr xmlns:wp14="http://schemas.microsoft.com/office/word/2010/wordml" wp14:textId="77777777">
       <w:trPr>
         <w:trHeight w:val="300"/>
       </w:trPr>
@@ -1943,9 +1766,10 @@
 </file>
 
 <file path=word/header1.xml><?xml version="1.0" encoding="utf-8"?>
-<w:hdr xmlns:wpc="http://schemas.microsoft.com/office/word/2010/wordprocessingCanvas" xmlns:mc="http://schemas.openxmlformats.org/markup-compatibility/2006" xmlns:o="urn:schemas-microsoft-com:office:office" xmlns:r="http://schemas.openxmlformats.org/officeDocument/2006/relationships" xmlns:m="http://schemas.openxmlformats.org/officeDocument/2006/math" xmlns:v="urn:schemas-microsoft-com:vml" xmlns:wp14="http://schemas.microsoft.com/office/word/2010/wordprocessingDrawing" xmlns:wp="http://schemas.openxmlformats.org/drawingml/2006/wordprocessingDrawing" xmlns:w10="urn:schemas-microsoft-com:office:word" xmlns:w="http://schemas.openxmlformats.org/wordprocessingml/2006/main" xmlns:w14="http://schemas.microsoft.com/office/word/2010/wordml" xmlns:w15="http://schemas.microsoft.com/office/word/2012/wordml" xmlns:wpg="http://schemas.microsoft.com/office/word/2010/wordprocessingGroup" xmlns:wpi="http://schemas.microsoft.com/office/word/2010/wordprocessingInk" xmlns:wne="http://schemas.microsoft.com/office/word/2006/wordml" xmlns:wps="http://schemas.microsoft.com/office/word/2010/wordprocessingShape" xmlns:cx="http://schemas.microsoft.com/office/drawing/2014/chartex" xmlns:cx1="http://schemas.microsoft.com/office/drawing/2015/9/8/chartex" xmlns:cx2="http://schemas.microsoft.com/office/drawing/2015/10/21/chartex" xmlns:cx3="http://schemas.microsoft.com/office/drawing/2016/5/9/chartex" xmlns:cx4="http://schemas.microsoft.com/office/drawing/2016/5/10/chartex" xmlns:cx5="http://schemas.microsoft.com/office/drawing/2016/5/11/chartex" xmlns:cx6="http://schemas.microsoft.com/office/drawing/2016/5/12/chartex" xmlns:cx7="http://schemas.microsoft.com/office/drawing/2016/5/13/chartex" xmlns:cx8="http://schemas.microsoft.com/office/drawing/2016/5/14/chartex" xmlns:w16cid="http://schemas.microsoft.com/office/word/2016/wordml/cid" xmlns:w16se="http://schemas.microsoft.com/office/word/2015/wordml/symex">
-  <w:p xmlns:wp14="http://schemas.microsoft.com/office/word/2010/wordml" wp14:textId="67E800EB">
+<w:hdr xmlns:wpc="http://schemas.microsoft.com/office/word/2010/wordprocessingCanvas" xmlns:mc="http://schemas.openxmlformats.org/markup-compatibility/2006" xmlns:o="urn:schemas-microsoft-com:office:office" xmlns:r="http://schemas.openxmlformats.org/officeDocument/2006/relationships" xmlns:m="http://schemas.openxmlformats.org/officeDocument/2006/math" xmlns:v="urn:schemas-microsoft-com:vml" xmlns:wp14="http://schemas.microsoft.com/office/word/2010/wordprocessingDrawing" xmlns:wp="http://schemas.openxmlformats.org/drawingml/2006/wordprocessingDrawing" xmlns:w10="urn:schemas-microsoft-com:office:word" xmlns:w="http://schemas.openxmlformats.org/wordprocessingml/2006/main" xmlns:w14="http://schemas.microsoft.com/office/word/2010/wordml" xmlns:w15="http://schemas.microsoft.com/office/word/2012/wordml" xmlns:wpg="http://schemas.microsoft.com/office/word/2010/wordprocessingGroup" xmlns:wpi="http://schemas.microsoft.com/office/word/2010/wordprocessingInk" xmlns:wne="http://schemas.microsoft.com/office/word/2006/wordml" xmlns:wps="http://schemas.microsoft.com/office/word/2010/wordprocessingShape" xmlns:cx="http://schemas.microsoft.com/office/drawing/2014/chartex" xmlns:cx1="http://schemas.microsoft.com/office/drawing/2015/9/8/chartex" xmlns:cx2="http://schemas.microsoft.com/office/drawing/2015/10/21/chartex" xmlns:cx3="http://schemas.microsoft.com/office/drawing/2016/5/9/chartex" xmlns:cx4="http://schemas.microsoft.com/office/drawing/2016/5/10/chartex" xmlns:cx5="http://schemas.microsoft.com/office/drawing/2016/5/11/chartex" xmlns:cx6="http://schemas.microsoft.com/office/drawing/2016/5/12/chartex" xmlns:cx7="http://schemas.microsoft.com/office/drawing/2016/5/13/chartex" xmlns:cx8="http://schemas.microsoft.com/office/drawing/2016/5/14/chartex" xmlns:w16cid="http://schemas.microsoft.com/office/word/2016/wordml/cid" xmlns:w16se="http://schemas.microsoft.com/office/word/2015/wordml/symex" xmlns:a="http://schemas.openxmlformats.org/drawingml/2006/main" xmlns:pic="http://schemas.openxmlformats.org/drawingml/2006/picture" xmlns:a14="http://schemas.microsoft.com/office/drawing/2010/main">
+  <w:p xmlns:wp14="http://schemas.microsoft.com/office/word/2010/wordml" wp14:textId="048CA413">
     <w:pPr>
+      <w:pStyle w:val="Normal"/>
       <w:pBdr>
         <w:bottom w:val="single" w:color="808080" w:sz="6" w:space="4"/>
       </w:pBdr>
@@ -1955,48 +1779,47 @@
       <w:spacing w:after="0"/>
     </w:pPr>
     <w:r>
-      <w:rPr>
-        <w:rFonts w:ascii="Arial" w:hAnsi="Arial" w:eastAsia="Arial" w:cs="Arial"/>
-        <w:b w:val="1"/>
-        <w:bCs w:val="1"/>
-        <w:sz w:val="20"/>
-        <w:szCs w:val="20"/>
-        <w:lang w:val="en-US"/>
-      </w:rPr>
-      <w:t>Alloha</w:t>
-    </w:r>
-    <w:r>
-      <w:rPr>
-        <w:rFonts w:ascii="Arial" w:hAnsi="Arial" w:eastAsia="Arial" w:cs="Arial"/>
-        <w:b w:val="1"/>
-        <w:bCs w:val="1"/>
-        <w:sz w:val="20"/>
-        <w:szCs w:val="20"/>
-        <w:lang w:val="en-US"/>
-      </w:rPr>
-      <w:t xml:space="preserve"> </w:t>
-    </w:r>
-    <w:r>
-      <w:rPr>
-        <w:rFonts w:ascii="Arial" w:hAnsi="Arial" w:eastAsia="Arial" w:cs="Arial"/>
-        <w:b w:val="1"/>
-        <w:bCs w:val="1"/>
-        <w:sz w:val="20"/>
-        <w:szCs w:val="20"/>
-        <w:lang w:val="en-US"/>
-      </w:rPr>
-      <w:t>Fibra</w:t>
-    </w:r>
-    <w:r>
-      <w:rPr>
-        <w:rFonts w:ascii="Arial" w:hAnsi="Arial" w:eastAsia="Arial" w:cs="Arial"/>
-        <w:b w:val="1"/>
-        <w:bCs w:val="1"/>
-        <w:sz w:val="20"/>
-        <w:szCs w:val="20"/>
-        <w:lang w:val="en-US"/>
-      </w:rPr>
-      <w:t xml:space="preserve"> </w:t>
+      <w:drawing>
+        <wp:inline xmlns:wp14="http://schemas.microsoft.com/office/word/2010/wordprocessingDrawing" wp14:editId="1434451B" wp14:anchorId="03F66B92">
+          <wp:extent cx="636126" cy="203886"/>
+          <wp:effectExtent l="0" t="0" r="0" b="0"/>
+          <wp:docPr id="1692090883" name="drawing" title="Ética e Integridade - Alloha Fibra"/>
+          <wp:cNvGraphicFramePr>
+            <a:graphicFrameLocks noChangeAspect="1"/>
+          </wp:cNvGraphicFramePr>
+          <a:graphic>
+            <a:graphicData xmlns:a="http://schemas.openxmlformats.org/drawingml/2006/main" uri="http://schemas.openxmlformats.org/drawingml/2006/picture">
+              <pic:pic xmlns:pic="http://schemas.openxmlformats.org/drawingml/2006/picture">
+                <pic:nvPicPr>
+                  <pic:cNvPr id="1692090883" name="Picture 1692090883"/>
+                  <pic:cNvPicPr/>
+                </pic:nvPicPr>
+                <pic:blipFill>
+                  <a:blip xmlns:r="http://schemas.openxmlformats.org/officeDocument/2006/relationships" r:embed="rId1422622114">
+                    <a:extLst>
+                      <a:ext uri="{28A0092B-C50C-407E-A947-70E740481C1C}">
+                        <a14:useLocalDpi xmlns:a14="http://schemas.microsoft.com/office/drawing/2010/main"/>
+                      </a:ext>
+                    </a:extLst>
+                  </a:blip>
+                  <a:stretch>
+                    <a:fillRect/>
+                  </a:stretch>
+                </pic:blipFill>
+                <pic:spPr>
+                  <a:xfrm rot="0">
+                    <a:off x="0" y="0"/>
+                    <a:ext cx="636126" cy="203886"/>
+                  </a:xfrm>
+                  <a:prstGeom prst="rect">
+                    <a:avLst/>
+                  </a:prstGeom>
+                </pic:spPr>
+              </pic:pic>
+            </a:graphicData>
+          </a:graphic>
+        </wp:inline>
+      </w:drawing>
     </w:r>
     <w:r>
       <w:rPr>
@@ -2004,9 +1827,9 @@
         <w:color w:val="666666"/>
         <w:sz w:val="16"/>
         <w:szCs w:val="16"/>
-        <w:lang w:val="en-US"/>
+        <w:lang w:val="pt-BR"/>
       </w:rPr>
-      <w:t>Acompanhamento</w:t>
+      <w:t xml:space="preserve">   </w:t>
     </w:r>
     <w:r>
       <w:rPr>
@@ -2014,39 +1837,9 @@
         <w:color w:val="666666"/>
         <w:sz w:val="16"/>
         <w:szCs w:val="16"/>
-        <w:lang w:val="en-US"/>
+        <w:lang w:val="pt-BR"/>
       </w:rPr>
-      <w:t xml:space="preserve"> de </w:t>
-    </w:r>
-    <w:r>
-      <w:rPr>
-        <w:rFonts w:ascii="Arial" w:hAnsi="Arial" w:eastAsia="Arial" w:cs="Arial"/>
-        <w:color w:val="666666"/>
-        <w:sz w:val="16"/>
-        <w:szCs w:val="16"/>
-        <w:lang w:val="en-US"/>
-      </w:rPr>
-      <w:t>Desempenho</w:t>
-    </w:r>
-    <w:r>
-      <w:rPr>
-        <w:rFonts w:ascii="Arial" w:hAnsi="Arial" w:eastAsia="Arial" w:cs="Arial"/>
-        <w:color w:val="666666"/>
-        <w:sz w:val="16"/>
-        <w:szCs w:val="16"/>
-        <w:lang w:val="en-US"/>
-      </w:rPr>
-      <w:t xml:space="preserve"> · </w:t>
-    </w:r>
-    <w:r>
-      <w:rPr>
-        <w:rFonts w:ascii="Arial" w:hAnsi="Arial" w:eastAsia="Arial" w:cs="Arial"/>
-        <w:color w:val="666666"/>
-        <w:sz w:val="16"/>
-        <w:szCs w:val="16"/>
-        <w:lang w:val="en-US"/>
-      </w:rPr>
-      <w:t>Retenção</w:t>
+      <w:t>Acompanhamento de Desempenho · Retenção</w:t>
     </w:r>
   </w:p>
 </w:hdr>
@@ -2055,7 +1848,7 @@
 <file path=word/numbering.xml><?xml version="1.0" encoding="utf-8"?>
 <w:numbering xmlns:wpc="http://schemas.microsoft.com/office/word/2010/wordprocessingCanvas" xmlns:mc="http://schemas.openxmlformats.org/markup-compatibility/2006" xmlns:o="urn:schemas-microsoft-com:office:office" xmlns:r="http://schemas.openxmlformats.org/officeDocument/2006/relationships" xmlns:m="http://schemas.openxmlformats.org/officeDocument/2006/math" xmlns:v="urn:schemas-microsoft-com:vml" xmlns:wp14="http://schemas.microsoft.com/office/word/2010/wordprocessingDrawing" xmlns:wp="http://schemas.openxmlformats.org/drawingml/2006/wordprocessingDrawing" xmlns:w10="urn:schemas-microsoft-com:office:word" xmlns:w="http://schemas.openxmlformats.org/wordprocessingml/2006/main" xmlns:w14="http://schemas.microsoft.com/office/word/2010/wordml" xmlns:w15="http://schemas.microsoft.com/office/word/2012/wordml" xmlns:wpg="http://schemas.microsoft.com/office/word/2010/wordprocessingGroup" xmlns:wpi="http://schemas.microsoft.com/office/word/2010/wordprocessingInk" xmlns:wne="http://schemas.microsoft.com/office/word/2006/wordml" xmlns:wps="http://schemas.microsoft.com/office/word/2010/wordprocessingShape" mc:Ignorable="w14 w15 wp14">
   <w:abstractNum w:abstractNumId="1" w15:restartNumberingAfterBreak="0">
-    <w:nsid w:val="4baa1ae1"/>
+    <w:nsid w:val="7df03f05"/>
     <w:multiLevelType w:val="hybridMultilevel"/>
     <w:lvl w:ilvl="0" w15:tentative="1">
       <w:start w:val="1"/>
@@ -2331,17 +2124,12 @@
       <w:szCs w:val="20"/>
     </w:rPr>
   </w:style>
-  <w:style xmlns:w14="http://schemas.microsoft.com/office/word/2010/wordml" xmlns:mc="http://schemas.openxmlformats.org/markup-compatibility/2006" xmlns:w="http://schemas.openxmlformats.org/wordprocessingml/2006/main" w:type="paragraph" w:styleId="Normal" w:default="1" mc:Ignorable="w14">
-    <w:name xmlns:w="http://schemas.openxmlformats.org/wordprocessingml/2006/main" w:val="Normal"/>
-    <w:uiPriority xmlns:w="http://schemas.openxmlformats.org/wordprocessingml/2006/main" w:val="0"/>
-    <w:qFormat xmlns:w="http://schemas.openxmlformats.org/wordprocessingml/2006/main"/>
-  </w:style>
   <w:style w:type="paragraph" w:styleId="Header">
     <w:uiPriority w:val="99"/>
     <w:name w:val="header"/>
     <w:basedOn w:val="Normal"/>
     <w:unhideWhenUsed/>
-    <w:rsid w:val="356D1F34"/>
+    <w:rsid w:val="18DF2133"/>
     <w:pPr>
       <w:tabs>
         <w:tab w:val="center" w:leader="none" w:pos="4680"/>
@@ -2355,7 +2143,7 @@
     <w:name w:val="footer"/>
     <w:basedOn w:val="Normal"/>
     <w:unhideWhenUsed/>
-    <w:rsid w:val="356D1F34"/>
+    <w:rsid w:val="18DF2133"/>
     <w:pPr>
       <w:tabs>
         <w:tab w:val="center" w:leader="none" w:pos="4680"/>
@@ -2406,5 +2194,10 @@
       </w:tblCellMar>
     </w:tblPr>
   </w:style>
+  <w:style xmlns:w14="http://schemas.microsoft.com/office/word/2010/wordml" xmlns:mc="http://schemas.openxmlformats.org/markup-compatibility/2006" xmlns:w="http://schemas.openxmlformats.org/wordprocessingml/2006/main" w:type="paragraph" w:styleId="Normal" w:default="1" mc:Ignorable="w14">
+    <w:name xmlns:w="http://schemas.openxmlformats.org/wordprocessingml/2006/main" w:val="Normal"/>
+    <w:uiPriority xmlns:w="http://schemas.openxmlformats.org/wordprocessingml/2006/main" w:val="0"/>
+    <w:qFormat xmlns:w="http://schemas.openxmlformats.org/wordprocessingml/2006/main"/>
+  </w:style>
 </w:styles>
 </file>
</xml_diff>